<commit_message>
Bind manuscript to Zenodo DOI for v1.0.6
</commit_message>
<xml_diff>
--- a/manuscript/human_genetics/PAPPA2_manuscript_Human_Genetics_Research_Article_v1.docx
+++ b/manuscript/human_genetics/PAPPA2_manuscript_Human_Genetics_Research_Article_v1.docx
@@ -4414,7 +4414,7 @@
         <w:rPr>
           <w:b w:val="0"/>
         </w:rPr>
-        <w:t>Archived version: https://doi.org/10.5281/zenodo.23698349</w:t>
+        <w:t>Archived version: https://doi.org/10.5281/zenodo.23733571</w:t>
       </w:r>
     </w:p>
     <w:p>
@@ -4503,7 +4503,7 @@
         <w:rPr>
           <w:b w:val="0"/>
         </w:rPr>
-        <w:t>Analysis code is available at https://github.com/ZhiPeng1022/pappa2-tal-analysis-unit-sensitivity. The versioned archive is available at https://doi.org/10.5281/zenodo.23698349. The archive identifier will be updated after the final version containing the signature-transfer and regulatory analyses is released.</w:t>
+        <w:t>Analysis code is available at https://github.com/ZhiPeng1022/pappa2-tal-analysis-unit-sensitivity. The versioned archive containing the signature-transfer, regulatory-support, and composition-expression analyses is available at https://doi.org/10.5281/zenodo.23733571.</w:t>
       </w:r>
     </w:p>
     <w:p>

</xml_diff>

<commit_message>
Bind manuscript to Zenodo DOI for v1.0.6 (#3)
</commit_message>
<xml_diff>
--- a/manuscript/human_genetics/PAPPA2_manuscript_Human_Genetics_Research_Article_v1.docx
+++ b/manuscript/human_genetics/PAPPA2_manuscript_Human_Genetics_Research_Article_v1.docx
@@ -4414,7 +4414,7 @@
         <w:rPr>
           <w:b w:val="0"/>
         </w:rPr>
-        <w:t>Archived version: https://doi.org/10.5281/zenodo.23698349</w:t>
+        <w:t>Archived version: https://doi.org/10.5281/zenodo.23733571</w:t>
       </w:r>
     </w:p>
     <w:p>
@@ -4503,7 +4503,7 @@
         <w:rPr>
           <w:b w:val="0"/>
         </w:rPr>
-        <w:t>Analysis code is available at https://github.com/ZhiPeng1022/pappa2-tal-analysis-unit-sensitivity. The versioned archive is available at https://doi.org/10.5281/zenodo.23698349. The archive identifier will be updated after the final version containing the signature-transfer and regulatory analyses is released.</w:t>
+        <w:t>Analysis code is available at https://github.com/ZhiPeng1022/pappa2-tal-analysis-unit-sensitivity. The versioned archive containing the signature-transfer, regulatory-support, and composition-expression analyses is available at https://doi.org/10.5281/zenodo.23733571.</w:t>
       </w:r>
     </w:p>
     <w:p>

</xml_diff>

<commit_message>
Add prespecified analysis-unit panel for v1.0.7
</commit_message>
<xml_diff>
--- a/manuscript/human_genetics/PAPPA2_manuscript_Human_Genetics_Research_Article_v1.docx
+++ b/manuscript/human_genetics/PAPPA2_manuscript_Human_Genetics_Research_Article_v1.docx
@@ -120,7 +120,7 @@
         <w:rPr>
           <w:b w:val="0"/>
         </w:rPr>
-        <w:t xml:space="preserve">Single-cell kidney atlases frequently describe disease-associated states as properties of a cell type, although donor composition, local neighborhood structure, and within-donor coupling measure different quantities. We tested whether these analysis units lead to the same subtype-level conclusion in the human thick ascending limb (TAL). We analyzed 106,851 KPMP single-nucleus TAL cells from 223 donors and compared donor pseudobulk, Milo neighborhood abundance, neighborhood-expression association, and within-donor cell-rank association across C-TAL-A, C-TAL-B, aTAL2, and frTAL. Stability was assessed with donor-aware models, leave-one-donor analysis, bootstrap, and cortex/medulla stratification. Key directions were tested in GSE211785 and GSE254185, two non-KPMP kidney resources. We also performed donor-stratified signature transfer and evaluated kidney tubulointerstitial eQTL and snATAC context. Complete and subset pseudobulk directions agreed in 48/60 comparisons, but 12 changed direction. In aTAL2, donor pseudobulk and neighborhood-expression association were positive, whereas the within-donor association was negative in combined disease and AKI (FDR = 0.0086 for each). frTAL showed a weaker related pattern. Signature transfer achieved 93.9% accuracy among assigned held-out cells and 93.9% aTAL2 recall. Both external cohorts supported donor-level </w:t>
+        <w:t xml:space="preserve">Single-cell kidney atlases frequently describe disease-associated states as properties of a cell type, although donor composition, local neighborhood structure, and within-donor coupling measure different quantities. We tested whether these analysis units lead to the same subtype-level conclusion in the human thick ascending limb (TAL). We analyzed 106,851 KPMP single-nucleus TAL cells from 223 donors and compared donor pseudobulk, Milo neighborhood abundance, neighborhood-expression association, and within-donor cell-rank association across C-TAL-A, C-TAL-B, aTAL2, and frTAL. Key directions were tested in GSE211785 and GSE254185, two non-KPMP kidney resources. Donor-stratified signature transfer and kidney tubulointerstitial eQTL and snATAC context were also evaluated. Complete and subset pseudobulk directions agreed in 48/60 comparisons, but 12 changed direction. In aTAL2, donor pseudobulk and neighborhood-expression association were positive, whereas the within-donor association was negative in combined disease and AKI (FDR = 0.0086 for each). In a prespecified 400-gene panel, donor-within reversal exceeded expression-matched random sets (18.6% versus 12.7%; empirical P = 0.000999). Signature transfer achieved 93.9% accuracy among assigned held-out cells and 93.9% aTAL2 recall. Both external cohorts supported donor-level </w:t>
       </w:r>
       <w:r>
         <w:rPr>
@@ -705,6 +705,53 @@
           <w:b/>
           <w:sz w:val="24"/>
         </w:rPr>
+        <w:t>Prespecified 400-gene analysis-unit panel</w:t>
+      </w:r>
+    </w:p>
+    <w:p>
+      <w:pPr>
+        <w:spacing w:line="480" w:lineRule="auto" w:after="0"/>
+      </w:pPr>
+      <w:r>
+        <w:rPr>
+          <w:b w:val="0"/>
+        </w:rPr>
+        <w:t xml:space="preserve">A 400-gene panel was frozen before the panel outcome analysis. The panel contained 100 TAL subtype markers, 100 MSigDB Hallmark injury, inflammatory, hypoxic, or metabolic genes, 100 genes coexpressed with </w:t>
+      </w:r>
+      <w:r>
+        <w:rPr>
+          <w:b w:val="0"/>
+          <w:i/>
+        </w:rPr>
+        <w:t>PAPPA2</w:t>
+      </w:r>
+      <w:r>
+        <w:rPr>
+          <w:b w:val="0"/>
+        </w:rPr>
+        <w:t xml:space="preserve"> in the 156 training donors, and 100 internal expression-matched negative controls. A separate 2,000-gene pool was matched to the target expression and detection distribution and used to generate 1,000 random 400-gene sets.</w:t>
+      </w:r>
+    </w:p>
+    <w:p>
+      <w:pPr>
+        <w:spacing w:line="480" w:lineRule="auto" w:after="0"/>
+      </w:pPr>
+      <w:r>
+        <w:rPr>
+          <w:b w:val="0"/>
+        </w:rPr>
+        <w:t>Only the three gene-specific units were compared across this panel: donor pseudobulk, neighborhood-expression association, and within-donor cell-rank association. A reversal required opposite signs and absolute standardized effects of at least 0.5 in both units. The primary endpoint was the donor-versus-within reversal fraction. One-sided empirical P values compared the target panel with the random sets. An expression-stratified random-set analysis was performed as a sensitivity check. The target-panel hash and frozen definitions are provided in Supplementary Table S21.</w:t>
+      </w:r>
+    </w:p>
+    <w:p>
+      <w:pPr>
+        <w:spacing w:line="480" w:lineRule="auto" w:after="0" w:before="120"/>
+      </w:pPr>
+      <w:r>
+        <w:rPr>
+          <w:b/>
+          <w:sz w:val="24"/>
+        </w:rPr>
         <w:t>KPMP eGFR analysis</w:t>
       </w:r>
     </w:p>
@@ -1868,6 +1915,64 @@
           <w:b/>
           <w:sz w:val="24"/>
         </w:rPr>
+        <w:t>Analysis-unit reversal was enriched in the prespecified TAL gene panel</w:t>
+      </w:r>
+    </w:p>
+    <w:p>
+      <w:pPr>
+        <w:spacing w:line="480" w:lineRule="auto" w:after="0"/>
+      </w:pPr>
+      <w:r>
+        <w:rPr>
+          <w:b w:val="0"/>
+        </w:rPr>
+        <w:t>The donor-versus-within reversal fraction was 18.6% in the 400-gene target panel, compared with 12.7% in expression-matched random sets (empirical P = 0.000999, the minimum attainable value with 1,000 sets). Restricting to the 300 biological genes increased the fraction to 20.7% versus 12.7%. An expression-stratified sensitivity analysis gave the same result (18.6% versus 12.8%; empirical P = 0.000999).</w:t>
+      </w:r>
+    </w:p>
+    <w:p>
+      <w:pPr>
+        <w:spacing w:line="480" w:lineRule="auto" w:after="0"/>
+      </w:pPr>
+      <w:r>
+        <w:rPr>
+          <w:b w:val="0"/>
+        </w:rPr>
+        <w:t xml:space="preserve">The panel result was not driven by the internal negative controls. Their donor-versus-within reversal fraction was 12.3%, statistically indistinguishable from random 100-gene sets from the external control pool (12.6%; two-sided empirical P = 0.825). Reversal fractions differed across biological groups: 25.1% for </w:t>
+      </w:r>
+      <w:r>
+        <w:rPr>
+          <w:b w:val="0"/>
+          <w:i/>
+        </w:rPr>
+        <w:t>PAPPA2</w:t>
+      </w:r>
+      <w:r>
+        <w:rPr>
+          <w:b w:val="0"/>
+        </w:rPr>
+        <w:t xml:space="preserve"> coexpression genes, 21.1% for TAL subtype markers, and 15.8% for injury, inflammatory, and metabolic genes.</w:t>
+      </w:r>
+    </w:p>
+    <w:p>
+      <w:pPr>
+        <w:spacing w:line="480" w:lineRule="auto" w:after="0"/>
+      </w:pPr>
+      <w:r>
+        <w:rPr>
+          <w:b w:val="0"/>
+        </w:rPr>
+        <w:t>Donor-versus-neighborhood reversal was also enriched (22.1% versus 14.3%; empirical P = 0.000999). In contrast, neighborhood-versus-within reversal was not significantly enriched (20.1% versus 19.5%; empirical P = 0.0949). Individual gene metrics and random-set results are provided in Supplementary Tables S22 and S23 and Supplementary Fig. S1. The analysis therefore supports a panel-level phenomenon, not a claim that every selected gene is robust.</w:t>
+      </w:r>
+    </w:p>
+    <w:p>
+      <w:pPr>
+        <w:spacing w:line="480" w:lineRule="auto" w:after="0" w:before="120"/>
+      </w:pPr>
+      <w:r>
+        <w:rPr>
+          <w:b/>
+          <w:sz w:val="24"/>
+        </w:rPr>
         <w:t>aTAL2 showed the strongest cross-unit discordance</w:t>
       </w:r>
     </w:p>
@@ -3214,6 +3319,68 @@
           <w:b/>
           <w:sz w:val="24"/>
         </w:rPr>
+        <w:t xml:space="preserve">The analysis-unit effect extends beyond the </w:t>
+      </w:r>
+      <w:r>
+        <w:rPr>
+          <w:b/>
+          <w:i/>
+          <w:sz w:val="24"/>
+        </w:rPr>
+        <w:t>PAPPA2</w:t>
+      </w:r>
+      <w:r>
+        <w:rPr>
+          <w:b/>
+          <w:sz w:val="24"/>
+        </w:rPr>
+        <w:t xml:space="preserve"> case</w:t>
+      </w:r>
+    </w:p>
+    <w:p>
+      <w:pPr>
+        <w:spacing w:line="480" w:lineRule="auto" w:after="0"/>
+      </w:pPr>
+      <w:r>
+        <w:rPr>
+          <w:b w:val="0"/>
+        </w:rPr>
+        <w:t xml:space="preserve">The prespecified 400-gene panel addresses the principal generalizability limitation of a single-gene study. Reversal between donor pseudobulk and within-donor coupling was nearly 50% more frequent in biologically selected TAL genes than in expression-matched controls (18.6% versus 12.7%). The result persisted after expression stratification and was strongest for </w:t>
+      </w:r>
+      <w:r>
+        <w:rPr>
+          <w:b w:val="0"/>
+          <w:i/>
+        </w:rPr>
+        <w:t>PAPPA2</w:t>
+      </w:r>
+      <w:r>
+        <w:rPr>
+          <w:b w:val="0"/>
+        </w:rPr>
+        <w:t>-coexpressed genes and TAL subtype markers. Internal negative controls were statistically indistinguishable from the external control pool.</w:t>
+      </w:r>
+    </w:p>
+    <w:p>
+      <w:pPr>
+        <w:spacing w:line="480" w:lineRule="auto" w:after="0"/>
+      </w:pPr>
+      <w:r>
+        <w:rPr>
+          <w:b w:val="0"/>
+        </w:rPr>
+        <w:t>The pattern was not universal. Injury, inflammatory, and metabolic genes showed a smaller excess, and neighborhood-versus-within reversal did not differ significantly from matched sets. The appropriate conclusion is therefore a panel-level phenomenon with graded biological groups, not a claim that all TAL genes are unstable or that every individual reversal is biologically meaningful.</w:t>
+      </w:r>
+    </w:p>
+    <w:p>
+      <w:pPr>
+        <w:spacing w:line="480" w:lineRule="auto" w:after="0" w:before="120"/>
+      </w:pPr>
+      <w:r>
+        <w:rPr>
+          <w:b/>
+          <w:sz w:val="24"/>
+        </w:rPr>
         <w:t>aTAL2 and frTAL show why analysis units cannot be merged</w:t>
       </w:r>
     </w:p>
@@ -3880,7 +4047,7 @@
         <w:rPr>
           <w:b w:val="0"/>
         </w:rPr>
-        <w:t xml:space="preserve">The central conclusion of this study is that the analysis unit is not a neutral choice in human kidney TAL single-cell data. Donor pseudobulk, Milo neighborhood abundance, neighborhood-expression association, and within-donor cell-rank association were not interchangeable: they yielded different subtype-level conclusions, with aTAL2 as the strongest cross-unit discordance example and frTAL as a weaker related pattern. Complete TAL coverage also changed selected gene and subtype conclusions relative to the smaller derivative matrix. </w:t>
+        <w:t xml:space="preserve">The central conclusion of this study is that the analysis unit is not a neutral choice in human kidney TAL single-cell data. Donor pseudobulk, Milo neighborhood abundance, neighborhood-expression association, and within-donor cell-rank association were not interchangeable: they yielded different subtype-level conclusions, with aTAL2 as the strongest cross-unit discordance example and frTAL as a weaker related pattern. Complete TAL coverage also changed selected gene and subtype conclusions relative to the smaller derivative matrix. A prespecified 400-gene panel showed that donor-versus-within reversal was more frequent in biologically selected TAL genes than in expression-matched controls, while internal negative controls matched the external control distribution. </w:t>
       </w:r>
       <w:r>
         <w:rPr>
@@ -4149,7 +4316,7 @@
         <w:rPr>
           <w:b w:val="0"/>
         </w:rPr>
-        <w:t>NephQTL2: human kidney eQTL resource</w:t>
+        <w:t>MSigDB: Molecular Signatures Database</w:t>
       </w:r>
     </w:p>
     <w:p>
@@ -4160,7 +4327,7 @@
         <w:rPr>
           <w:b w:val="0"/>
         </w:rPr>
-        <w:t>OR: odds ratio</w:t>
+        <w:t>NephQTL2: human kidney eQTL resource</w:t>
       </w:r>
     </w:p>
     <w:p>
@@ -4170,15 +4337,8 @@
       <w:r>
         <w:rPr>
           <w:b w:val="0"/>
-          <w:i/>
-        </w:rPr>
-        <w:t>PAPPA2</w:t>
-      </w:r>
-      <w:r>
-        <w:rPr>
-          <w:b w:val="0"/>
-        </w:rPr>
-        <w:t>: pappalysin 2</w:t>
+        </w:rPr>
+        <w:t>OR: odds ratio</w:t>
       </w:r>
     </w:p>
     <w:p>
@@ -4188,8 +4348,15 @@
       <w:r>
         <w:rPr>
           <w:b w:val="0"/>
-        </w:rPr>
-        <w:t>pQTL: protein quantitative trait locus</w:t>
+          <w:i/>
+        </w:rPr>
+        <w:t>PAPPA2</w:t>
+      </w:r>
+      <w:r>
+        <w:rPr>
+          <w:b w:val="0"/>
+        </w:rPr>
+        <w:t>: pappalysin 2</w:t>
       </w:r>
     </w:p>
     <w:p>
@@ -4200,7 +4367,7 @@
         <w:rPr>
           <w:b w:val="0"/>
         </w:rPr>
-        <w:t>PTWAS: probabilistic transcriptome-wide association study</w:t>
+        <w:t>pQTL: protein quantitative trait locus</w:t>
       </w:r>
     </w:p>
     <w:p>
@@ -4211,7 +4378,7 @@
         <w:rPr>
           <w:b w:val="0"/>
         </w:rPr>
-        <w:t>snATAC-seq: single-nucleus assay for transposase-accessible chromatin sequencing</w:t>
+        <w:t>PTWAS: probabilistic transcriptome-wide association study</w:t>
       </w:r>
     </w:p>
     <w:p>
@@ -4222,7 +4389,7 @@
         <w:rPr>
           <w:b w:val="0"/>
         </w:rPr>
-        <w:t>snRNA-seq: single-nucleus RNA sequencing</w:t>
+        <w:t>snATAC-seq: single-nucleus assay for transposase-accessible chromatin sequencing</w:t>
       </w:r>
     </w:p>
     <w:p>
@@ -4233,7 +4400,7 @@
         <w:rPr>
           <w:b w:val="0"/>
         </w:rPr>
-        <w:t>SpatialFDR: spatial false discovery rate</w:t>
+        <w:t>snRNA-seq: single-nucleus RNA sequencing</w:t>
       </w:r>
     </w:p>
     <w:p>
@@ -4244,7 +4411,7 @@
         <w:rPr>
           <w:b w:val="0"/>
         </w:rPr>
-        <w:t>TAL: thick ascending limb</w:t>
+        <w:t>SpatialFDR: spatial false discovery rate</w:t>
       </w:r>
     </w:p>
     <w:p>
@@ -4255,11 +4422,22 @@
         <w:rPr>
           <w:b w:val="0"/>
         </w:rPr>
-        <w:t>UMAP: uniform manifold approximation and projection</w:t>
+        <w:t>TAL: thick ascending limb</w:t>
       </w:r>
     </w:p>
     <w:p>
       <w:pPr>
+        <w:spacing w:line="480" w:lineRule="auto" w:after="0"/>
+      </w:pPr>
+      <w:r>
+        <w:rPr>
+          <w:b w:val="0"/>
+        </w:rPr>
+        <w:t>UMAP: uniform manifold approximation and projection</w:t>
+      </w:r>
+    </w:p>
+    <w:p>
+      <w:pPr>
         <w:spacing w:line="480" w:lineRule="auto" w:after="0" w:before="240"/>
       </w:pPr>
       <w:r>
@@ -4480,7 +4658,7 @@
         <w:rPr>
           <w:b w:val="0"/>
         </w:rPr>
-        <w:t>The processed analysis tables supporting the conclusions of this article are included in Supplementary Tables S1-S20.</w:t>
+        <w:t>The processed analysis tables supporting the conclusions of this article are included in Supplementary Tables S1-S23.</w:t>
       </w:r>
     </w:p>
     <w:p>
@@ -4909,6 +5087,50 @@
           <w:b w:val="0"/>
         </w:rPr>
         <w:t xml:space="preserve"> and control genes.</w:t>
+      </w:r>
+    </w:p>
+    <w:p>
+      <w:pPr>
+        <w:spacing w:line="480" w:lineRule="auto" w:after="0"/>
+      </w:pPr>
+      <w:r>
+        <w:rPr>
+          <w:b w:val="0"/>
+        </w:rPr>
+        <w:t>Supplementary Table S21. File format: Comma-separated values (.csv). Title: Prespecified 400-gene panel and matched control pool. Description: Group assignment, selection rank, expression, and detection statistics for the target panel and the 2,000-gene external negative-control pool.</w:t>
+      </w:r>
+    </w:p>
+    <w:p>
+      <w:pPr>
+        <w:spacing w:line="480" w:lineRule="auto" w:after="0"/>
+      </w:pPr>
+      <w:r>
+        <w:rPr>
+          <w:b w:val="0"/>
+        </w:rPr>
+        <w:t>Supplementary Table S22. File format: Comma-separated values (.csv). Title: Gene-level analysis-unit metrics. Description: Donor pseudobulk, neighborhood-expression, and within-donor effects with validity flags and standardized reversal indicators for all panel and control genes.</w:t>
+      </w:r>
+    </w:p>
+    <w:p>
+      <w:pPr>
+        <w:spacing w:line="480" w:lineRule="auto" w:after="0"/>
+      </w:pPr>
+      <w:r>
+        <w:rPr>
+          <w:b w:val="0"/>
+        </w:rPr>
+        <w:t>Supplementary Table S23. File format: Comma-separated values (.csv). Title: Random-set analysis-unit sensitivity results. Description: Gene-level reversal fractions for 1,000 random 400-gene and 300-gene sets from the expression-matched negative-control pool, including expression-stratified sensitivity sets.</w:t>
+      </w:r>
+    </w:p>
+    <w:p>
+      <w:pPr>
+        <w:spacing w:line="480" w:lineRule="auto" w:after="0"/>
+      </w:pPr>
+      <w:r>
+        <w:rPr>
+          <w:b w:val="0"/>
+        </w:rPr>
+        <w:t>Supplementary Fig. S1. File format: Tagged Image File Format (.tif). Title: Prespecified analysis-unit panel validation. Description: a, Random-set null distribution for donor-within reversal with the 400-gene target and 300-gene biological-panel values. b, Donor-within reversal by panel group. c, Target versus expression-stratified random sets for the three gene-specific unit pairs, with empirical P values.</w:t>
       </w:r>
     </w:p>
     <w:p>

</xml_diff>

<commit_message>
Add prespecified analysis-unit panel for v1.0.7 (#4)
</commit_message>
<xml_diff>
--- a/manuscript/human_genetics/PAPPA2_manuscript_Human_Genetics_Research_Article_v1.docx
+++ b/manuscript/human_genetics/PAPPA2_manuscript_Human_Genetics_Research_Article_v1.docx
@@ -120,7 +120,7 @@
         <w:rPr>
           <w:b w:val="0"/>
         </w:rPr>
-        <w:t xml:space="preserve">Single-cell kidney atlases frequently describe disease-associated states as properties of a cell type, although donor composition, local neighborhood structure, and within-donor coupling measure different quantities. We tested whether these analysis units lead to the same subtype-level conclusion in the human thick ascending limb (TAL). We analyzed 106,851 KPMP single-nucleus TAL cells from 223 donors and compared donor pseudobulk, Milo neighborhood abundance, neighborhood-expression association, and within-donor cell-rank association across C-TAL-A, C-TAL-B, aTAL2, and frTAL. Stability was assessed with donor-aware models, leave-one-donor analysis, bootstrap, and cortex/medulla stratification. Key directions were tested in GSE211785 and GSE254185, two non-KPMP kidney resources. We also performed donor-stratified signature transfer and evaluated kidney tubulointerstitial eQTL and snATAC context. Complete and subset pseudobulk directions agreed in 48/60 comparisons, but 12 changed direction. In aTAL2, donor pseudobulk and neighborhood-expression association were positive, whereas the within-donor association was negative in combined disease and AKI (FDR = 0.0086 for each). frTAL showed a weaker related pattern. Signature transfer achieved 93.9% accuracy among assigned held-out cells and 93.9% aTAL2 recall. Both external cohorts supported donor-level </w:t>
+        <w:t xml:space="preserve">Single-cell kidney atlases frequently describe disease-associated states as properties of a cell type, although donor composition, local neighborhood structure, and within-donor coupling measure different quantities. We tested whether these analysis units lead to the same subtype-level conclusion in the human thick ascending limb (TAL). We analyzed 106,851 KPMP single-nucleus TAL cells from 223 donors and compared donor pseudobulk, Milo neighborhood abundance, neighborhood-expression association, and within-donor cell-rank association across C-TAL-A, C-TAL-B, aTAL2, and frTAL. Key directions were tested in GSE211785 and GSE254185, two non-KPMP kidney resources. Donor-stratified signature transfer and kidney tubulointerstitial eQTL and snATAC context were also evaluated. Complete and subset pseudobulk directions agreed in 48/60 comparisons, but 12 changed direction. In aTAL2, donor pseudobulk and neighborhood-expression association were positive, whereas the within-donor association was negative in combined disease and AKI (FDR = 0.0086 for each). In a prespecified 400-gene panel, donor-within reversal exceeded expression-matched random sets (18.6% versus 12.7%; empirical P = 0.000999). Signature transfer achieved 93.9% accuracy among assigned held-out cells and 93.9% aTAL2 recall. Both external cohorts supported donor-level </w:t>
       </w:r>
       <w:r>
         <w:rPr>
@@ -705,6 +705,53 @@
           <w:b/>
           <w:sz w:val="24"/>
         </w:rPr>
+        <w:t>Prespecified 400-gene analysis-unit panel</w:t>
+      </w:r>
+    </w:p>
+    <w:p>
+      <w:pPr>
+        <w:spacing w:line="480" w:lineRule="auto" w:after="0"/>
+      </w:pPr>
+      <w:r>
+        <w:rPr>
+          <w:b w:val="0"/>
+        </w:rPr>
+        <w:t xml:space="preserve">A 400-gene panel was frozen before the panel outcome analysis. The panel contained 100 TAL subtype markers, 100 MSigDB Hallmark injury, inflammatory, hypoxic, or metabolic genes, 100 genes coexpressed with </w:t>
+      </w:r>
+      <w:r>
+        <w:rPr>
+          <w:b w:val="0"/>
+          <w:i/>
+        </w:rPr>
+        <w:t>PAPPA2</w:t>
+      </w:r>
+      <w:r>
+        <w:rPr>
+          <w:b w:val="0"/>
+        </w:rPr>
+        <w:t xml:space="preserve"> in the 156 training donors, and 100 internal expression-matched negative controls. A separate 2,000-gene pool was matched to the target expression and detection distribution and used to generate 1,000 random 400-gene sets.</w:t>
+      </w:r>
+    </w:p>
+    <w:p>
+      <w:pPr>
+        <w:spacing w:line="480" w:lineRule="auto" w:after="0"/>
+      </w:pPr>
+      <w:r>
+        <w:rPr>
+          <w:b w:val="0"/>
+        </w:rPr>
+        <w:t>Only the three gene-specific units were compared across this panel: donor pseudobulk, neighborhood-expression association, and within-donor cell-rank association. A reversal required opposite signs and absolute standardized effects of at least 0.5 in both units. The primary endpoint was the donor-versus-within reversal fraction. One-sided empirical P values compared the target panel with the random sets. An expression-stratified random-set analysis was performed as a sensitivity check. The target-panel hash and frozen definitions are provided in Supplementary Table S21.</w:t>
+      </w:r>
+    </w:p>
+    <w:p>
+      <w:pPr>
+        <w:spacing w:line="480" w:lineRule="auto" w:after="0" w:before="120"/>
+      </w:pPr>
+      <w:r>
+        <w:rPr>
+          <w:b/>
+          <w:sz w:val="24"/>
+        </w:rPr>
         <w:t>KPMP eGFR analysis</w:t>
       </w:r>
     </w:p>
@@ -1868,6 +1915,64 @@
           <w:b/>
           <w:sz w:val="24"/>
         </w:rPr>
+        <w:t>Analysis-unit reversal was enriched in the prespecified TAL gene panel</w:t>
+      </w:r>
+    </w:p>
+    <w:p>
+      <w:pPr>
+        <w:spacing w:line="480" w:lineRule="auto" w:after="0"/>
+      </w:pPr>
+      <w:r>
+        <w:rPr>
+          <w:b w:val="0"/>
+        </w:rPr>
+        <w:t>The donor-versus-within reversal fraction was 18.6% in the 400-gene target panel, compared with 12.7% in expression-matched random sets (empirical P = 0.000999, the minimum attainable value with 1,000 sets). Restricting to the 300 biological genes increased the fraction to 20.7% versus 12.7%. An expression-stratified sensitivity analysis gave the same result (18.6% versus 12.8%; empirical P = 0.000999).</w:t>
+      </w:r>
+    </w:p>
+    <w:p>
+      <w:pPr>
+        <w:spacing w:line="480" w:lineRule="auto" w:after="0"/>
+      </w:pPr>
+      <w:r>
+        <w:rPr>
+          <w:b w:val="0"/>
+        </w:rPr>
+        <w:t xml:space="preserve">The panel result was not driven by the internal negative controls. Their donor-versus-within reversal fraction was 12.3%, statistically indistinguishable from random 100-gene sets from the external control pool (12.6%; two-sided empirical P = 0.825). Reversal fractions differed across biological groups: 25.1% for </w:t>
+      </w:r>
+      <w:r>
+        <w:rPr>
+          <w:b w:val="0"/>
+          <w:i/>
+        </w:rPr>
+        <w:t>PAPPA2</w:t>
+      </w:r>
+      <w:r>
+        <w:rPr>
+          <w:b w:val="0"/>
+        </w:rPr>
+        <w:t xml:space="preserve"> coexpression genes, 21.1% for TAL subtype markers, and 15.8% for injury, inflammatory, and metabolic genes.</w:t>
+      </w:r>
+    </w:p>
+    <w:p>
+      <w:pPr>
+        <w:spacing w:line="480" w:lineRule="auto" w:after="0"/>
+      </w:pPr>
+      <w:r>
+        <w:rPr>
+          <w:b w:val="0"/>
+        </w:rPr>
+        <w:t>Donor-versus-neighborhood reversal was also enriched (22.1% versus 14.3%; empirical P = 0.000999). In contrast, neighborhood-versus-within reversal was not significantly enriched (20.1% versus 19.5%; empirical P = 0.0949). Individual gene metrics and random-set results are provided in Supplementary Tables S22 and S23 and Supplementary Fig. S1. The analysis therefore supports a panel-level phenomenon, not a claim that every selected gene is robust.</w:t>
+      </w:r>
+    </w:p>
+    <w:p>
+      <w:pPr>
+        <w:spacing w:line="480" w:lineRule="auto" w:after="0" w:before="120"/>
+      </w:pPr>
+      <w:r>
+        <w:rPr>
+          <w:b/>
+          <w:sz w:val="24"/>
+        </w:rPr>
         <w:t>aTAL2 showed the strongest cross-unit discordance</w:t>
       </w:r>
     </w:p>
@@ -3214,6 +3319,68 @@
           <w:b/>
           <w:sz w:val="24"/>
         </w:rPr>
+        <w:t xml:space="preserve">The analysis-unit effect extends beyond the </w:t>
+      </w:r>
+      <w:r>
+        <w:rPr>
+          <w:b/>
+          <w:i/>
+          <w:sz w:val="24"/>
+        </w:rPr>
+        <w:t>PAPPA2</w:t>
+      </w:r>
+      <w:r>
+        <w:rPr>
+          <w:b/>
+          <w:sz w:val="24"/>
+        </w:rPr>
+        <w:t xml:space="preserve"> case</w:t>
+      </w:r>
+    </w:p>
+    <w:p>
+      <w:pPr>
+        <w:spacing w:line="480" w:lineRule="auto" w:after="0"/>
+      </w:pPr>
+      <w:r>
+        <w:rPr>
+          <w:b w:val="0"/>
+        </w:rPr>
+        <w:t xml:space="preserve">The prespecified 400-gene panel addresses the principal generalizability limitation of a single-gene study. Reversal between donor pseudobulk and within-donor coupling was nearly 50% more frequent in biologically selected TAL genes than in expression-matched controls (18.6% versus 12.7%). The result persisted after expression stratification and was strongest for </w:t>
+      </w:r>
+      <w:r>
+        <w:rPr>
+          <w:b w:val="0"/>
+          <w:i/>
+        </w:rPr>
+        <w:t>PAPPA2</w:t>
+      </w:r>
+      <w:r>
+        <w:rPr>
+          <w:b w:val="0"/>
+        </w:rPr>
+        <w:t>-coexpressed genes and TAL subtype markers. Internal negative controls were statistically indistinguishable from the external control pool.</w:t>
+      </w:r>
+    </w:p>
+    <w:p>
+      <w:pPr>
+        <w:spacing w:line="480" w:lineRule="auto" w:after="0"/>
+      </w:pPr>
+      <w:r>
+        <w:rPr>
+          <w:b w:val="0"/>
+        </w:rPr>
+        <w:t>The pattern was not universal. Injury, inflammatory, and metabolic genes showed a smaller excess, and neighborhood-versus-within reversal did not differ significantly from matched sets. The appropriate conclusion is therefore a panel-level phenomenon with graded biological groups, not a claim that all TAL genes are unstable or that every individual reversal is biologically meaningful.</w:t>
+      </w:r>
+    </w:p>
+    <w:p>
+      <w:pPr>
+        <w:spacing w:line="480" w:lineRule="auto" w:after="0" w:before="120"/>
+      </w:pPr>
+      <w:r>
+        <w:rPr>
+          <w:b/>
+          <w:sz w:val="24"/>
+        </w:rPr>
         <w:t>aTAL2 and frTAL show why analysis units cannot be merged</w:t>
       </w:r>
     </w:p>
@@ -3880,7 +4047,7 @@
         <w:rPr>
           <w:b w:val="0"/>
         </w:rPr>
-        <w:t xml:space="preserve">The central conclusion of this study is that the analysis unit is not a neutral choice in human kidney TAL single-cell data. Donor pseudobulk, Milo neighborhood abundance, neighborhood-expression association, and within-donor cell-rank association were not interchangeable: they yielded different subtype-level conclusions, with aTAL2 as the strongest cross-unit discordance example and frTAL as a weaker related pattern. Complete TAL coverage also changed selected gene and subtype conclusions relative to the smaller derivative matrix. </w:t>
+        <w:t xml:space="preserve">The central conclusion of this study is that the analysis unit is not a neutral choice in human kidney TAL single-cell data. Donor pseudobulk, Milo neighborhood abundance, neighborhood-expression association, and within-donor cell-rank association were not interchangeable: they yielded different subtype-level conclusions, with aTAL2 as the strongest cross-unit discordance example and frTAL as a weaker related pattern. Complete TAL coverage also changed selected gene and subtype conclusions relative to the smaller derivative matrix. A prespecified 400-gene panel showed that donor-versus-within reversal was more frequent in biologically selected TAL genes than in expression-matched controls, while internal negative controls matched the external control distribution. </w:t>
       </w:r>
       <w:r>
         <w:rPr>
@@ -4149,7 +4316,7 @@
         <w:rPr>
           <w:b w:val="0"/>
         </w:rPr>
-        <w:t>NephQTL2: human kidney eQTL resource</w:t>
+        <w:t>MSigDB: Molecular Signatures Database</w:t>
       </w:r>
     </w:p>
     <w:p>
@@ -4160,7 +4327,7 @@
         <w:rPr>
           <w:b w:val="0"/>
         </w:rPr>
-        <w:t>OR: odds ratio</w:t>
+        <w:t>NephQTL2: human kidney eQTL resource</w:t>
       </w:r>
     </w:p>
     <w:p>
@@ -4170,15 +4337,8 @@
       <w:r>
         <w:rPr>
           <w:b w:val="0"/>
-          <w:i/>
-        </w:rPr>
-        <w:t>PAPPA2</w:t>
-      </w:r>
-      <w:r>
-        <w:rPr>
-          <w:b w:val="0"/>
-        </w:rPr>
-        <w:t>: pappalysin 2</w:t>
+        </w:rPr>
+        <w:t>OR: odds ratio</w:t>
       </w:r>
     </w:p>
     <w:p>
@@ -4188,8 +4348,15 @@
       <w:r>
         <w:rPr>
           <w:b w:val="0"/>
-        </w:rPr>
-        <w:t>pQTL: protein quantitative trait locus</w:t>
+          <w:i/>
+        </w:rPr>
+        <w:t>PAPPA2</w:t>
+      </w:r>
+      <w:r>
+        <w:rPr>
+          <w:b w:val="0"/>
+        </w:rPr>
+        <w:t>: pappalysin 2</w:t>
       </w:r>
     </w:p>
     <w:p>
@@ -4200,7 +4367,7 @@
         <w:rPr>
           <w:b w:val="0"/>
         </w:rPr>
-        <w:t>PTWAS: probabilistic transcriptome-wide association study</w:t>
+        <w:t>pQTL: protein quantitative trait locus</w:t>
       </w:r>
     </w:p>
     <w:p>
@@ -4211,7 +4378,7 @@
         <w:rPr>
           <w:b w:val="0"/>
         </w:rPr>
-        <w:t>snATAC-seq: single-nucleus assay for transposase-accessible chromatin sequencing</w:t>
+        <w:t>PTWAS: probabilistic transcriptome-wide association study</w:t>
       </w:r>
     </w:p>
     <w:p>
@@ -4222,7 +4389,7 @@
         <w:rPr>
           <w:b w:val="0"/>
         </w:rPr>
-        <w:t>snRNA-seq: single-nucleus RNA sequencing</w:t>
+        <w:t>snATAC-seq: single-nucleus assay for transposase-accessible chromatin sequencing</w:t>
       </w:r>
     </w:p>
     <w:p>
@@ -4233,7 +4400,7 @@
         <w:rPr>
           <w:b w:val="0"/>
         </w:rPr>
-        <w:t>SpatialFDR: spatial false discovery rate</w:t>
+        <w:t>snRNA-seq: single-nucleus RNA sequencing</w:t>
       </w:r>
     </w:p>
     <w:p>
@@ -4244,7 +4411,7 @@
         <w:rPr>
           <w:b w:val="0"/>
         </w:rPr>
-        <w:t>TAL: thick ascending limb</w:t>
+        <w:t>SpatialFDR: spatial false discovery rate</w:t>
       </w:r>
     </w:p>
     <w:p>
@@ -4255,11 +4422,22 @@
         <w:rPr>
           <w:b w:val="0"/>
         </w:rPr>
-        <w:t>UMAP: uniform manifold approximation and projection</w:t>
+        <w:t>TAL: thick ascending limb</w:t>
       </w:r>
     </w:p>
     <w:p>
       <w:pPr>
+        <w:spacing w:line="480" w:lineRule="auto" w:after="0"/>
+      </w:pPr>
+      <w:r>
+        <w:rPr>
+          <w:b w:val="0"/>
+        </w:rPr>
+        <w:t>UMAP: uniform manifold approximation and projection</w:t>
+      </w:r>
+    </w:p>
+    <w:p>
+      <w:pPr>
         <w:spacing w:line="480" w:lineRule="auto" w:after="0" w:before="240"/>
       </w:pPr>
       <w:r>
@@ -4480,7 +4658,7 @@
         <w:rPr>
           <w:b w:val="0"/>
         </w:rPr>
-        <w:t>The processed analysis tables supporting the conclusions of this article are included in Supplementary Tables S1-S20.</w:t>
+        <w:t>The processed analysis tables supporting the conclusions of this article are included in Supplementary Tables S1-S23.</w:t>
       </w:r>
     </w:p>
     <w:p>
@@ -4909,6 +5087,50 @@
           <w:b w:val="0"/>
         </w:rPr>
         <w:t xml:space="preserve"> and control genes.</w:t>
+      </w:r>
+    </w:p>
+    <w:p>
+      <w:pPr>
+        <w:spacing w:line="480" w:lineRule="auto" w:after="0"/>
+      </w:pPr>
+      <w:r>
+        <w:rPr>
+          <w:b w:val="0"/>
+        </w:rPr>
+        <w:t>Supplementary Table S21. File format: Comma-separated values (.csv). Title: Prespecified 400-gene panel and matched control pool. Description: Group assignment, selection rank, expression, and detection statistics for the target panel and the 2,000-gene external negative-control pool.</w:t>
+      </w:r>
+    </w:p>
+    <w:p>
+      <w:pPr>
+        <w:spacing w:line="480" w:lineRule="auto" w:after="0"/>
+      </w:pPr>
+      <w:r>
+        <w:rPr>
+          <w:b w:val="0"/>
+        </w:rPr>
+        <w:t>Supplementary Table S22. File format: Comma-separated values (.csv). Title: Gene-level analysis-unit metrics. Description: Donor pseudobulk, neighborhood-expression, and within-donor effects with validity flags and standardized reversal indicators for all panel and control genes.</w:t>
+      </w:r>
+    </w:p>
+    <w:p>
+      <w:pPr>
+        <w:spacing w:line="480" w:lineRule="auto" w:after="0"/>
+      </w:pPr>
+      <w:r>
+        <w:rPr>
+          <w:b w:val="0"/>
+        </w:rPr>
+        <w:t>Supplementary Table S23. File format: Comma-separated values (.csv). Title: Random-set analysis-unit sensitivity results. Description: Gene-level reversal fractions for 1,000 random 400-gene and 300-gene sets from the expression-matched negative-control pool, including expression-stratified sensitivity sets.</w:t>
+      </w:r>
+    </w:p>
+    <w:p>
+      <w:pPr>
+        <w:spacing w:line="480" w:lineRule="auto" w:after="0"/>
+      </w:pPr>
+      <w:r>
+        <w:rPr>
+          <w:b w:val="0"/>
+        </w:rPr>
+        <w:t>Supplementary Fig. S1. File format: Tagged Image File Format (.tif). Title: Prespecified analysis-unit panel validation. Description: a, Random-set null distribution for donor-within reversal with the 400-gene target and 300-gene biological-panel values. b, Donor-within reversal by panel group. c, Target versus expression-stratified random sets for the three gene-specific unit pairs, with empirical P values.</w:t>
       </w:r>
     </w:p>
     <w:p>

</xml_diff>

<commit_message>
Bind manuscript to Zenodo DOI for v1.0.6 (#5)
</commit_message>
<xml_diff>
--- a/manuscript/human_genetics/PAPPA2_manuscript_Human_Genetics_Research_Article_v1.docx
+++ b/manuscript/human_genetics/PAPPA2_manuscript_Human_Genetics_Research_Article_v1.docx
@@ -4592,7 +4592,7 @@
         <w:rPr>
           <w:b w:val="0"/>
         </w:rPr>
-        <w:t>Archived version: https://doi.org/10.5281/zenodo.23733571</w:t>
+        <w:t>Archived version: https://doi.org/10.5281/zenodo.23734944</w:t>
       </w:r>
     </w:p>
     <w:p>
@@ -4681,7 +4681,7 @@
         <w:rPr>
           <w:b w:val="0"/>
         </w:rPr>
-        <w:t>Analysis code is available at https://github.com/ZhiPeng1022/pappa2-tal-analysis-unit-sensitivity. The versioned archive containing the signature-transfer, regulatory-support, and composition-expression analyses is available at https://doi.org/10.5281/zenodo.23733571.</w:t>
+        <w:t>Analysis code is available at https://github.com/ZhiPeng1022/pappa2-tal-analysis-unit-sensitivity. The versioned archive containing the signature-transfer, regulatory-support, composition-expression, and prespecified analysis-unit panel is available at https://doi.org/10.5281/zenodo.23734944.</w:t>
       </w:r>
     </w:p>
     <w:p>

</xml_diff>